<commit_message>
grpc up to lection 26
</commit_message>
<xml_diff>
--- a/GRPC/grpc.docx
+++ b/GRPC/grpc.docx
@@ -1,6 +1,6 @@
 
 <file path=word/document.xml><?xml version="1.0" encoding="utf-8"?>
-<w:document xmlns:wpc="http://schemas.microsoft.com/office/word/2010/wordprocessingCanvas" xmlns:cx="http://schemas.microsoft.com/office/drawing/2014/chartex" xmlns:mc="http://schemas.openxmlformats.org/markup-compatibility/2006" xmlns:o="urn:schemas-microsoft-com:office:office" xmlns:r="http://schemas.openxmlformats.org/officeDocument/2006/relationships" xmlns:m="http://schemas.openxmlformats.org/officeDocument/2006/math" xmlns:v="urn:schemas-microsoft-com:vml" xmlns:wp14="http://schemas.microsoft.com/office/word/2010/wordprocessingDrawing" xmlns:wp="http://schemas.openxmlformats.org/drawingml/2006/wordprocessingDrawing" xmlns:w10="urn:schemas-microsoft-com:office:word" xmlns:w="http://schemas.openxmlformats.org/wordprocessingml/2006/main" xmlns:w14="http://schemas.microsoft.com/office/word/2010/wordml" xmlns:w15="http://schemas.microsoft.com/office/word/2012/wordml" xmlns:w16se="http://schemas.microsoft.com/office/word/2015/wordml/symex" xmlns:wpg="http://schemas.microsoft.com/office/word/2010/wordprocessingGroup" xmlns:wpi="http://schemas.microsoft.com/office/word/2010/wordprocessingInk" xmlns:wne="http://schemas.microsoft.com/office/word/2006/wordml" xmlns:wps="http://schemas.microsoft.com/office/word/2010/wordprocessingShape" mc:Ignorable="w14 w15 w16se wp14">
+<w:document xmlns:wpc="http://schemas.microsoft.com/office/word/2010/wordprocessingCanvas" xmlns:cx="http://schemas.microsoft.com/office/drawing/2014/chartex" xmlns:cx1="http://schemas.microsoft.com/office/drawing/2015/9/8/chartex" xmlns:cx2="http://schemas.microsoft.com/office/drawing/2015/10/21/chartex" xmlns:cx3="http://schemas.microsoft.com/office/drawing/2016/5/9/chartex" xmlns:cx4="http://schemas.microsoft.com/office/drawing/2016/5/10/chartex" xmlns:cx5="http://schemas.microsoft.com/office/drawing/2016/5/11/chartex" xmlns:cx6="http://schemas.microsoft.com/office/drawing/2016/5/12/chartex" xmlns:cx7="http://schemas.microsoft.com/office/drawing/2016/5/13/chartex" xmlns:cx8="http://schemas.microsoft.com/office/drawing/2016/5/14/chartex" xmlns:mc="http://schemas.openxmlformats.org/markup-compatibility/2006" xmlns:aink="http://schemas.microsoft.com/office/drawing/2016/ink" xmlns:am3d="http://schemas.microsoft.com/office/drawing/2017/model3d" xmlns:o="urn:schemas-microsoft-com:office:office" xmlns:oel="http://schemas.microsoft.com/office/2019/extlst" xmlns:r="http://schemas.openxmlformats.org/officeDocument/2006/relationships" xmlns:m="http://schemas.openxmlformats.org/officeDocument/2006/math" xmlns:v="urn:schemas-microsoft-com:vml" xmlns:wp14="http://schemas.microsoft.com/office/word/2010/wordprocessingDrawing" xmlns:wp="http://schemas.openxmlformats.org/drawingml/2006/wordprocessingDrawing" xmlns:w10="urn:schemas-microsoft-com:office:word" xmlns:w="http://schemas.openxmlformats.org/wordprocessingml/2006/main" xmlns:w14="http://schemas.microsoft.com/office/word/2010/wordml" xmlns:w15="http://schemas.microsoft.com/office/word/2012/wordml" xmlns:w16cex="http://schemas.microsoft.com/office/word/2018/wordml/cex" xmlns:w16cid="http://schemas.microsoft.com/office/word/2016/wordml/cid" xmlns:w16="http://schemas.microsoft.com/office/word/2018/wordml" xmlns:w16du="http://schemas.microsoft.com/office/word/2023/wordml/word16du" xmlns:w16sdtdh="http://schemas.microsoft.com/office/word/2020/wordml/sdtdatahash" xmlns:w16sdtfl="http://schemas.microsoft.com/office/word/2024/wordml/sdtformatlock" xmlns:w16se="http://schemas.microsoft.com/office/word/2015/wordml/symex" xmlns:wpg="http://schemas.microsoft.com/office/word/2010/wordprocessingGroup" xmlns:wpi="http://schemas.microsoft.com/office/word/2010/wordprocessingInk" xmlns:wne="http://schemas.microsoft.com/office/word/2006/wordml" xmlns:wps="http://schemas.microsoft.com/office/word/2010/wordprocessingShape" mc:Ignorable="w14 w15 w16se w16cid w16 w16cex w16sdtdh w16sdtfl w16du wp14">
   <w:body>
     <w:p>
       <w:pPr>
@@ -11,7 +11,6 @@
           <w:szCs w:val="18"/>
         </w:rPr>
       </w:pPr>
-      <w:proofErr w:type="spellStart"/>
       <w:r>
         <w:rPr>
           <w:rFonts w:ascii="Consolas" w:hAnsi="Consolas"/>
@@ -19,9 +18,9 @@
           <w:sz w:val="18"/>
           <w:szCs w:val="18"/>
         </w:rPr>
-        <w:t>gRPC</w:t>
-      </w:r>
-      <w:proofErr w:type="spellEnd"/>
+        <w:t xml:space="preserve"> </w:t>
+      </w:r>
+      <w:proofErr w:type="spellStart"/>
       <w:r>
         <w:rPr>
           <w:rFonts w:ascii="Consolas" w:hAnsi="Consolas"/>
@@ -29,27 +28,28 @@
           <w:sz w:val="18"/>
           <w:szCs w:val="18"/>
         </w:rPr>
-        <w:t xml:space="preserve"> </w:t>
-      </w:r>
-    </w:p>
-    <w:p>
-      <w:pPr>
+        <w:t>gRPC</w:t>
+      </w:r>
+      <w:proofErr w:type="spellEnd"/>
+      <w:r>
         <w:rPr>
           <w:rFonts w:ascii="Consolas" w:hAnsi="Consolas"/>
           <w:color w:val="1D1C1D"/>
           <w:sz w:val="18"/>
           <w:szCs w:val="18"/>
         </w:rPr>
-      </w:pPr>
-      <w:r>
+        <w:t xml:space="preserve"> </w:t>
+      </w:r>
+    </w:p>
+    <w:p>
+      <w:pPr>
         <w:rPr>
           <w:rFonts w:ascii="Consolas" w:hAnsi="Consolas"/>
           <w:color w:val="1D1C1D"/>
           <w:sz w:val="18"/>
           <w:szCs w:val="18"/>
         </w:rPr>
-        <w:t>–</w:t>
-      </w:r>
+      </w:pPr>
       <w:r>
         <w:rPr>
           <w:rFonts w:ascii="Consolas" w:hAnsi="Consolas"/>
@@ -57,7 +57,7 @@
           <w:sz w:val="18"/>
           <w:szCs w:val="18"/>
         </w:rPr>
-        <w:t xml:space="preserve"> what is </w:t>
+        <w:t xml:space="preserve">– what is </w:t>
       </w:r>
       <w:proofErr w:type="spellStart"/>
       <w:r>
@@ -137,8 +137,6 @@
         </w:rPr>
         <w:t xml:space="preserve"> </w:t>
       </w:r>
-      <w:bookmarkStart w:id="0" w:name="_GoBack"/>
-      <w:bookmarkEnd w:id="0"/>
     </w:p>
     <w:p>
       <w:pPr>
@@ -320,13 +318,7 @@
         <w:rPr>
           <w:sz w:val="24"/>
         </w:rPr>
-        <w:t xml:space="preserve"> -</w:t>
-      </w:r>
-      <w:r>
-        <w:rPr>
-          <w:sz w:val="24"/>
-        </w:rPr>
-        <w:t>Call a function on another computer like it’s a local one.</w:t>
+        <w:t xml:space="preserve"> -Call a function on another computer like it’s a local one.</w:t>
       </w:r>
     </w:p>
     <w:p>
@@ -436,13 +428,7 @@
         </w:rPr>
       </w:pPr>
       <w:r>
-        <w:t xml:space="preserve">They governance and managing </w:t>
-      </w:r>
-      <w:r>
-        <w:t>Kubernetes</w:t>
-      </w:r>
-      <w:r>
-        <w:t xml:space="preserve">, Prometheus </w:t>
+        <w:t xml:space="preserve">They governance and managing Kubernetes, Prometheus </w:t>
       </w:r>
     </w:p>
     <w:p>
@@ -705,21 +691,7 @@
         <w:rPr>
           <w:sz w:val="28"/>
         </w:rPr>
-        <w:t xml:space="preserve">Platform/Language neutral mechanism developed by google for serializing and </w:t>
-      </w:r>
-      <w:proofErr w:type="spellStart"/>
-      <w:r>
-        <w:rPr>
-          <w:sz w:val="28"/>
-        </w:rPr>
-        <w:t>deserializing</w:t>
-      </w:r>
-      <w:proofErr w:type="spellEnd"/>
-      <w:r>
-        <w:rPr>
-          <w:sz w:val="28"/>
-        </w:rPr>
-        <w:t xml:space="preserve"> structured data</w:t>
+        <w:t>Platform/Language neutral mechanism developed by google for serializing and deserializing structured data</w:t>
       </w:r>
     </w:p>
     <w:p>
@@ -823,14 +795,62 @@
         <w:rPr>
           <w:sz w:val="28"/>
         </w:rPr>
-        <w:t xml:space="preserve">Less time to serialize and </w:t>
+        <w:t>Less time to serialize and deserialize</w:t>
+      </w:r>
+      <w:r>
+        <w:rPr>
+          <w:sz w:val="28"/>
+        </w:rPr>
+        <w:t xml:space="preserve"> (why?)</w:t>
+      </w:r>
+    </w:p>
+    <w:p>
+      <w:pPr>
+        <w:pStyle w:val="ListParagraph"/>
+        <w:numPr>
+          <w:ilvl w:val="2"/>
+          <w:numId w:val="2"/>
+        </w:numPr>
+        <w:rPr>
+          <w:sz w:val="28"/>
+        </w:rPr>
+      </w:pPr>
+      <w:r>
+        <w:rPr>
+          <w:sz w:val="28"/>
+        </w:rPr>
+        <w:t>Because of proto file schema</w:t>
+      </w:r>
+      <w:r>
+        <w:rPr>
+          <w:sz w:val="28"/>
+        </w:rPr>
+        <w:t xml:space="preserve"> (will explain basic proto file)</w:t>
+      </w:r>
+    </w:p>
+    <w:p>
+      <w:pPr>
+        <w:pStyle w:val="ListParagraph"/>
+        <w:numPr>
+          <w:ilvl w:val="2"/>
+          <w:numId w:val="2"/>
+        </w:numPr>
+        <w:rPr>
+          <w:sz w:val="28"/>
+        </w:rPr>
+      </w:pPr>
+      <w:r>
+        <w:rPr>
+          <w:sz w:val="28"/>
+        </w:rPr>
+        <w:t xml:space="preserve">And doesn’t need to serialize into </w:t>
       </w:r>
       <w:proofErr w:type="spellStart"/>
       <w:r>
         <w:rPr>
           <w:sz w:val="28"/>
         </w:rPr>
-        <w:t>deserialize</w:t>
+        <w:t>json</w:t>
       </w:r>
       <w:proofErr w:type="spellEnd"/>
     </w:p>
@@ -895,7 +915,7 @@
 </file>
 
 <file path=word/numbering.xml><?xml version="1.0" encoding="utf-8"?>
-<w:numbering xmlns:wpc="http://schemas.microsoft.com/office/word/2010/wordprocessingCanvas" xmlns:cx="http://schemas.microsoft.com/office/drawing/2014/chartex" xmlns:mc="http://schemas.openxmlformats.org/markup-compatibility/2006" xmlns:o="urn:schemas-microsoft-com:office:office" xmlns:r="http://schemas.openxmlformats.org/officeDocument/2006/relationships" xmlns:m="http://schemas.openxmlformats.org/officeDocument/2006/math" xmlns:v="urn:schemas-microsoft-com:vml" xmlns:wp14="http://schemas.microsoft.com/office/word/2010/wordprocessingDrawing" xmlns:wp="http://schemas.openxmlformats.org/drawingml/2006/wordprocessingDrawing" xmlns:w10="urn:schemas-microsoft-com:office:word" xmlns:w="http://schemas.openxmlformats.org/wordprocessingml/2006/main" xmlns:w14="http://schemas.microsoft.com/office/word/2010/wordml" xmlns:w15="http://schemas.microsoft.com/office/word/2012/wordml" xmlns:w16se="http://schemas.microsoft.com/office/word/2015/wordml/symex" xmlns:wpg="http://schemas.microsoft.com/office/word/2010/wordprocessingGroup" xmlns:wpi="http://schemas.microsoft.com/office/word/2010/wordprocessingInk" xmlns:wne="http://schemas.microsoft.com/office/word/2006/wordml" xmlns:wps="http://schemas.microsoft.com/office/word/2010/wordprocessingShape" mc:Ignorable="w14 w15 w16se wp14">
+<w:numbering xmlns:wpc="http://schemas.microsoft.com/office/word/2010/wordprocessingCanvas" xmlns:cx="http://schemas.microsoft.com/office/drawing/2014/chartex" xmlns:cx1="http://schemas.microsoft.com/office/drawing/2015/9/8/chartex" xmlns:cx2="http://schemas.microsoft.com/office/drawing/2015/10/21/chartex" xmlns:cx3="http://schemas.microsoft.com/office/drawing/2016/5/9/chartex" xmlns:cx4="http://schemas.microsoft.com/office/drawing/2016/5/10/chartex" xmlns:cx5="http://schemas.microsoft.com/office/drawing/2016/5/11/chartex" xmlns:cx6="http://schemas.microsoft.com/office/drawing/2016/5/12/chartex" xmlns:cx7="http://schemas.microsoft.com/office/drawing/2016/5/13/chartex" xmlns:cx8="http://schemas.microsoft.com/office/drawing/2016/5/14/chartex" xmlns:mc="http://schemas.openxmlformats.org/markup-compatibility/2006" xmlns:aink="http://schemas.microsoft.com/office/drawing/2016/ink" xmlns:am3d="http://schemas.microsoft.com/office/drawing/2017/model3d" xmlns:o="urn:schemas-microsoft-com:office:office" xmlns:oel="http://schemas.microsoft.com/office/2019/extlst" xmlns:r="http://schemas.openxmlformats.org/officeDocument/2006/relationships" xmlns:m="http://schemas.openxmlformats.org/officeDocument/2006/math" xmlns:v="urn:schemas-microsoft-com:vml" xmlns:wp14="http://schemas.microsoft.com/office/word/2010/wordprocessingDrawing" xmlns:wp="http://schemas.openxmlformats.org/drawingml/2006/wordprocessingDrawing" xmlns:w10="urn:schemas-microsoft-com:office:word" xmlns:w="http://schemas.openxmlformats.org/wordprocessingml/2006/main" xmlns:w14="http://schemas.microsoft.com/office/word/2010/wordml" xmlns:w15="http://schemas.microsoft.com/office/word/2012/wordml" xmlns:w16cex="http://schemas.microsoft.com/office/word/2018/wordml/cex" xmlns:w16cid="http://schemas.microsoft.com/office/word/2016/wordml/cid" xmlns:w16="http://schemas.microsoft.com/office/word/2018/wordml" xmlns:w16du="http://schemas.microsoft.com/office/word/2023/wordml/word16du" xmlns:w16sdtdh="http://schemas.microsoft.com/office/word/2020/wordml/sdtdatahash" xmlns:w16sdtfl="http://schemas.microsoft.com/office/word/2024/wordml/sdtformatlock" xmlns:w16se="http://schemas.microsoft.com/office/word/2015/wordml/symex" xmlns:wpg="http://schemas.microsoft.com/office/word/2010/wordprocessingGroup" xmlns:wpi="http://schemas.microsoft.com/office/word/2010/wordprocessingInk" xmlns:wne="http://schemas.microsoft.com/office/word/2006/wordml" xmlns:wps="http://schemas.microsoft.com/office/word/2010/wordprocessingShape" mc:Ignorable="w14 w15 w16se w16cid w16 w16cex w16sdtdh w16sdtfl w16du wp14">
   <w:abstractNum w:abstractNumId="0" w15:restartNumberingAfterBreak="0">
     <w:nsid w:val="4A7D6579"/>
     <w:multiLevelType w:val="hybridMultilevel"/>
@@ -1037,7 +1057,7 @@
         <w:rFonts w:ascii="Courier New" w:hAnsi="Courier New" w:cs="Courier New" w:hint="default"/>
       </w:rPr>
     </w:lvl>
-    <w:lvl w:ilvl="2" w:tplc="04090005" w:tentative="1">
+    <w:lvl w:ilvl="2" w:tplc="04090005">
       <w:start w:val="1"/>
       <w:numFmt w:val="bullet"/>
       <w:lvlText w:val=""/>
@@ -1122,17 +1142,17 @@
       </w:rPr>
     </w:lvl>
   </w:abstractNum>
-  <w:num w:numId="1">
+  <w:num w:numId="1" w16cid:durableId="1008943117">
     <w:abstractNumId w:val="0"/>
   </w:num>
-  <w:num w:numId="2">
+  <w:num w:numId="2" w16cid:durableId="442186076">
     <w:abstractNumId w:val="1"/>
   </w:num>
 </w:numbering>
 </file>
 
 <file path=word/styles.xml><?xml version="1.0" encoding="utf-8"?>
-<w:styles xmlns:mc="http://schemas.openxmlformats.org/markup-compatibility/2006" xmlns:r="http://schemas.openxmlformats.org/officeDocument/2006/relationships" xmlns:w="http://schemas.openxmlformats.org/wordprocessingml/2006/main" xmlns:w14="http://schemas.microsoft.com/office/word/2010/wordml" xmlns:w15="http://schemas.microsoft.com/office/word/2012/wordml" xmlns:w16se="http://schemas.microsoft.com/office/word/2015/wordml/symex" mc:Ignorable="w14 w15 w16se">
+<w:styles xmlns:mc="http://schemas.openxmlformats.org/markup-compatibility/2006" xmlns:r="http://schemas.openxmlformats.org/officeDocument/2006/relationships" xmlns:w="http://schemas.openxmlformats.org/wordprocessingml/2006/main" xmlns:w14="http://schemas.microsoft.com/office/word/2010/wordml" xmlns:w15="http://schemas.microsoft.com/office/word/2012/wordml" xmlns:w16cex="http://schemas.microsoft.com/office/word/2018/wordml/cex" xmlns:w16cid="http://schemas.microsoft.com/office/word/2016/wordml/cid" xmlns:w16="http://schemas.microsoft.com/office/word/2018/wordml" xmlns:w16du="http://schemas.microsoft.com/office/word/2023/wordml/word16du" xmlns:w16sdtdh="http://schemas.microsoft.com/office/word/2020/wordml/sdtdatahash" xmlns:w16sdtfl="http://schemas.microsoft.com/office/word/2024/wordml/sdtformatlock" xmlns:w16se="http://schemas.microsoft.com/office/word/2015/wordml/symex" mc:Ignorable="w14 w15 w16se w16cid w16 w16cex w16sdtdh w16sdtfl w16du">
   <w:docDefaults>
     <w:rPrDefault>
       <w:rPr>
@@ -1148,7 +1168,7 @@
       </w:pPr>
     </w:pPrDefault>
   </w:docDefaults>
-  <w:latentStyles w:defLockedState="0" w:defUIPriority="99" w:defSemiHidden="0" w:defUnhideWhenUsed="0" w:defQFormat="0" w:count="371">
+  <w:latentStyles w:defLockedState="0" w:defUIPriority="99" w:defSemiHidden="0" w:defUnhideWhenUsed="0" w:defQFormat="0" w:count="376">
     <w:lsdException w:name="Normal" w:uiPriority="0" w:qFormat="1"/>
     <w:lsdException w:name="heading 1" w:uiPriority="9" w:qFormat="1"/>
     <w:lsdException w:name="heading 2" w:semiHidden="1" w:uiPriority="9" w:unhideWhenUsed="1" w:qFormat="1"/>
@@ -1520,6 +1540,11 @@
     <w:lsdException w:name="List Table 5 Dark Accent 6" w:uiPriority="50"/>
     <w:lsdException w:name="List Table 6 Colorful Accent 6" w:uiPriority="51"/>
     <w:lsdException w:name="List Table 7 Colorful Accent 6" w:uiPriority="52"/>
+    <w:lsdException w:name="Mention" w:semiHidden="1" w:unhideWhenUsed="1"/>
+    <w:lsdException w:name="Smart Hyperlink" w:semiHidden="1" w:unhideWhenUsed="1"/>
+    <w:lsdException w:name="Hashtag" w:semiHidden="1" w:unhideWhenUsed="1"/>
+    <w:lsdException w:name="Unresolved Mention" w:semiHidden="1" w:unhideWhenUsed="1"/>
+    <w:lsdException w:name="Smart Link" w:semiHidden="1" w:unhideWhenUsed="1"/>
   </w:latentStyles>
   <w:style w:type="paragraph" w:default="1" w:styleId="Normal">
     <w:name w:val="Normal"/>

</xml_diff>